<commit_message>
Manuale: logo sul frontespizio e indice automatico
L'icona di Pasifae centrata sopra il titolo e, dopo il frontespizio,
la pagina «Indice» con un campo TOC (capitoli e sezioni) che Word e
LibreOffice rigenerano all'apertura; il capitolo 1 parte su pagina
nuova.

Co-Authored-By: Claude Fable 5 <noreply@anthropic.com>
</commit_message>
<xml_diff>
--- a/Manuale di Pasifae.docx
+++ b/Manuale di Pasifae.docx
@@ -2,6 +2,45 @@
 <file path=word/document.xml><?xml version="1.0" encoding="utf-8"?>
 <w:document xmlns:w="http://schemas.openxmlformats.org/wordprocessingml/2006/main" xmlns:m="http://schemas.openxmlformats.org/officeDocument/2006/math" xmlns:r="http://schemas.openxmlformats.org/officeDocument/2006/relationships" xmlns:o="urn:schemas-microsoft-com:office:office" xmlns:v="urn:schemas-microsoft-com:vml" xmlns:w10="urn:schemas-microsoft-com:office:word" xmlns:a="http://schemas.openxmlformats.org/drawingml/2006/main" xmlns:pic="http://schemas.openxmlformats.org/drawingml/2006/picture" xmlns:wp="http://schemas.openxmlformats.org/drawingml/2006/wordprocessingDrawing">
   <w:body>
+    <w:p>
+      <w:pPr>
+        <w:jc w:val="center"/>
+      </w:pPr>
+      <w:r>
+        <w:drawing>
+          <wp:inline>
+            <wp:extent cx="1980000" cy="1980000"/>
+            <wp:docPr id="1" name="Picture 1"/>
+            <wp:cNvGraphicFramePr>
+              <a:graphicFrameLocks noChangeAspect="1"/>
+            </wp:cNvGraphicFramePr>
+            <a:graphic>
+              <a:graphicData uri="http://schemas.openxmlformats.org/drawingml/2006/picture">
+                <pic:pic>
+                  <pic:nvPicPr>
+                    <pic:cNvPr id="0" name="pasifae_256.png"/>
+                    <pic:cNvPicPr/>
+                  </pic:nvPicPr>
+                  <pic:blipFill>
+                    <a:blip r:embed="rId9"/>
+                    <a:stretch>
+                      <a:fillRect/>
+                    </a:stretch>
+                  </pic:blipFill>
+                  <pic:spPr>
+                    <a:xfrm>
+                      <a:off x="0" y="0"/>
+                      <a:ext cx="1980000" cy="1980000"/>
+                    </a:xfrm>
+                    <a:prstGeom prst="rect"/>
+                  </pic:spPr>
+                </pic:pic>
+              </a:graphicData>
+            </a:graphic>
+          </wp:inline>
+        </w:drawing>
+      </w:r>
+    </w:p>
     <w:p>
       <w:pPr>
         <w:pStyle w:val="Title"/>
@@ -61,6 +100,41 @@
       </w:sdtContent>
     </w:sdt>
     <w:bookmarkStart w:id="13" w:name="benvenuti-in-pasifae"/>
+    <w:p>
+      <w:r>
+        <w:br w:type="page"/>
+      </w:r>
+    </w:p>
+    <w:p>
+      <w:pPr>
+        <w:pStyle w:val="TOCHeading"/>
+      </w:pPr>
+      <w:r>
+        <w:t>Indice</w:t>
+      </w:r>
+    </w:p>
+    <w:p>
+      <w:r>
+        <w:fldChar w:fldCharType="begin" w:dirty="true"/>
+      </w:r>
+      <w:r>
+        <w:instrText xml:space="preserve"> TOC \o "1-2" \h \z \u </w:instrText>
+      </w:r>
+      <w:r>
+        <w:fldChar w:fldCharType="separate"/>
+      </w:r>
+      <w:r>
+        <w:t>(l'indice si genera all'apertura: se non compare, clic destro → Aggiorna campo)</w:t>
+      </w:r>
+      <w:r>
+        <w:fldChar w:fldCharType="end"/>
+      </w:r>
+    </w:p>
+    <w:p>
+      <w:r>
+        <w:br w:type="page"/>
+      </w:r>
+    </w:p>
     <w:p>
       <w:pPr>
         <w:pStyle w:val="Heading1"/>

</xml_diff>

<commit_message>
gui 2.2.0: mini-mappa nel player, popolata via via che si esplora
Nuovo pannello a destra (dopo illustrazione e trascrizione) che mostra
le stanze visitate e i loro collegamenti, sola lettura. Dalle stanze
visitate, le uscite verso l'ignoto restano solo accennate (trattino o
etichetta), mai un riquadro "?": niente fog-of-war, solo ciò che il
giocatore già sa dal testo; le uscite condizionate non sbloccate non
compaiono affatto. I riquadri si ridimensionano da soli per riempire
lo spazio del pannello (tra un minimo leggibile e un massimo), invece
di restare a dimensione fissa con parecchio spazio sprecato quando le
stanze visitate sono poche.

Nuova funzione pura advcore.mappa.uscite_visibili() e nuovo modulo
gui/mappa_player.py; le funzioni di layout a griglia sono condivise
con l'editor via gui/mappa.py. Aggiornati VERSIONI.md, CLAUDE.md e il
manuale d'uso.

Co-Authored-By: Claude Sonnet 5 <noreply@anthropic.com>
</commit_message>
<xml_diff>
--- a/Manuale di Pasifae.docx
+++ b/Manuale di Pasifae.docx
@@ -129,7 +129,7 @@
         <w:rPr/>
       </w:pPr>
       <w:r>
-        <w:t>Edizione 2026 · Pasifae Editor 2.1 · Pasifae Engine 1.16</w:t>
+        <w:t>Edizione 2026 · Pasifae Editor 2.2 · Pasifae Engine 1.17</w:t>
       </w:r>
       <w:r/>
     </w:p>
@@ -3764,7 +3764,7 @@
         <w:t xml:space="preserve"> </w:t>
       </w:r>
       <w:r>
-        <w:t xml:space="preserve">l’avventura finita, con illustrazioni, salvataggi e temi chiaro/scuro.</w:t>
+        <w:t>l’avventura finita, con illustrazioni, mini-mappa, salvataggi e temi chiaro/scuro.</w:t>
       </w:r>
       <w:r/>
     </w:p>
@@ -22353,6 +22353,22 @@
       </w:r>
       <w:bookmarkEnd w:id="78"/>
       <w:r/>
+    </w:p>
+    <w:p>
+      <w:pPr>
+        <w:pStyle w:val="736"/>
+      </w:pPr>
+      <w:r>
+        <w:t>La mini-mappa del giocatore</w:t>
+      </w:r>
+    </w:p>
+    <w:p>
+      <w:pPr>
+        <w:pStyle w:val="724"/>
+      </w:pPr>
+      <w:r>
+        <w:t>Il pannello a destra della trascrizione — dopo l'illustrazione, se attiva — mostra le stanze già visitate e come si collegano fra loro: cresce via via che si esplora, senza fare spoiler. Dalle stanze visitate, un trattino verso il bordo (o una breve etichetta, per le uscite non cardinali come su/giù/dentro/fuori) segnala che di là si può andare, senza svelarne nome o contenuto — le uscite condizionate non ancora sbloccate restano del tutto invisibili. Si disattiva da Visualizza ▸ Mappa; su finestre strette lascia comunque il posto alla colonna di lettura.</w:t>
+      </w:r>
     </w:p>
     <w:p>
       <w:pPr>

</xml_diff>

<commit_message>
advcore 1.18.0 / gui 2.3.0: dialoghi disaccoppiati da "parla" e dai png
Nuovo effetto di regola avvia_dialogo: apre il dialogo (saluto +
battute) di un oggetto qualsiasi, non solo dei personaggi (png),
agganciandolo al verbo che l'autore preferisce. Nato dal caso concreto
di un terminale: si usa, non si parla, e "Saluti terminale." non ha
senso come congedo — ora personalizzabile con props["congedo"]
(default invariato). Il verbo builtin "parla" resta bloccato sui
non-png come prima; la logica di apertura dialogo è stata estratta da
Motore a funzioni pure condivise in advcore/rules.py.

Editor: nuovo campo "congedo" nel form Oggetto e nuova voce
"avvia dialogo" nel catalogo effetti delle regole. Aggiornati
VERSIONI.md, CLAUDE.md e il manuale d'uso (nuova sezione dedicata nel
capitolo 8, con l'esempio del terminale).

Co-Authored-By: Claude Sonnet 5 <noreply@anthropic.com>
</commit_message>
<xml_diff>
--- a/Manuale di Pasifae.docx
+++ b/Manuale di Pasifae.docx
@@ -129,7 +129,7 @@
         <w:rPr/>
       </w:pPr>
       <w:r>
-        <w:t>Edizione 2026 · Pasifae Editor 2.2 · Pasifae Engine 1.17</w:t>
+        <w:t>Edizione 2026 · Pasifae Editor 2.3 · Pasifae Engine 1.18</w:t>
       </w:r>
       <w:r/>
     </w:p>
@@ -14500,6 +14500,29 @@
           </w:p>
         </w:tc>
       </w:tr>
+      <w:tr>
+        <w:trPr/>
+        <w:tc>
+          <w:tcPr>
+            <w:tcBorders/>
+          </w:tcPr>
+          <w:p>
+            <w:r>
+              <w:t>avvia dialogo</w:t>
+            </w:r>
+          </w:p>
+        </w:tc>
+        <w:tc>
+          <w:tcPr>
+            <w:tcBorders/>
+          </w:tcPr>
+          <w:p>
+            <w:r>
+              <w:t>apre il dialogo (saluto + battute) di un oggetto qualsiasi, non serve che sia un png (capitolo 8)</w:t>
+            </w:r>
+          </w:p>
+        </w:tc>
+      </w:tr>
     </w:tbl>
     <w:p>
       <w:pPr>
@@ -16289,6 +16312,20 @@
         <w:t xml:space="preserve">);</w:t>
       </w:r>
       <w:r/>
+    </w:p>
+    <w:p>
+      <w:pPr>
+        <w:pStyle w:val="725"/>
+      </w:pPr>
+      <w:r>
+        <w:rPr>
+          <w:b/>
+        </w:rPr>
+        <w:t>congedo</w:t>
+      </w:r>
+      <w:r>
+        <w:t xml:space="preserve"> — il messaggio di chiusura della conversazione, se volete sostituire il default («Saluti «nome».»); soprattutto utile se l'oggetto non è un personaggio (vedi il riquadro più sotto);</w:t>
+      </w:r>
     </w:p>
     <w:p>
       <w:pPr>
@@ -17518,6 +17555,22 @@
       </w:r>
       <w:bookmarkEnd w:id="54"/>
       <w:r/>
+    </w:p>
+    <w:p>
+      <w:pPr>
+        <w:pStyle w:val="724"/>
+      </w:pPr>
+      <w:r>
+        <w:t>Saluto, battute e stato di conversazione non richiedono che l'oggetto sia spuntato come «personaggio (png)»: qualunque oggetto può averli — un terminale, per esempio, che ha senso usare ma non ha senso salutare. Per aprirgli il dialogo senza passare da «parla» (bloccato sui non-personaggi, e comunque «parla con il terminale» suona male), aggiungete una regola che intercetta il verbo giusto — «usa terminale» — con l'effetto avvia dialogo (saluto + battute). E se il commiato di default, «Saluti «nome».», non calza, scrivete un congedo: comparirà al posto suo, sia quando il giocatore esce sia quando le battute finiscono da sole.</w:t>
+      </w:r>
+    </w:p>
+    <w:p>
+      <w:pPr>
+        <w:pStyle w:val="736"/>
+      </w:pPr>
+      <w:r>
+        <w:t>Un dialogo su un oggetto che non è un personaggio</w:t>
+      </w:r>
     </w:p>
     <w:p>
       <w:pPr>

</xml_diff>

<commit_message>
Manuale: corretto l'ordine e aggiunto un esempio per avvia_dialogo
La sezione "Un dialogo su un oggetto che non è un personaggio" (cap. 8)
aveva il titolo dopo il paragrafo invece che prima, e mancava l'esempio
di codice che accompagna ogni altro concetto del capitolo. Aggiunta la
regola d'esempio (usa terminale -> avvia_dialogo) nello stesso stile
dello snippet "Mostra il sigillo" poco sopra.

Co-Authored-By: Claude Sonnet 5 <noreply@anthropic.com>
</commit_message>
<xml_diff>
--- a/Manuale di Pasifae.docx
+++ b/Manuale di Pasifae.docx
@@ -17558,18 +17558,37 @@
     </w:p>
     <w:p>
       <w:pPr>
-        <w:pStyle w:val="724"/>
-      </w:pPr>
-      <w:r>
-        <w:t>Saluto, battute e stato di conversazione non richiedono che l'oggetto sia spuntato come «personaggio (png)»: qualunque oggetto può averli — un terminale, per esempio, che ha senso usare ma non ha senso salutare. Per aprirgli il dialogo senza passare da «parla» (bloccato sui non-personaggi, e comunque «parla con il terminale» suona male), aggiungete una regola che intercetta il verbo giusto — «usa terminale» — con l'effetto avvia dialogo (saluto + battute). E se il commiato di default, «Saluti «nome».», non calza, scrivete un congedo: comparirà al posto suo, sia quando il giocatore esce sia quando le battute finiscono da sole.</w:t>
+        <w:pStyle w:val="736"/>
+      </w:pPr>
+      <w:r>
+        <w:t>Un dialogo su un oggetto che non è un personaggio</w:t>
       </w:r>
     </w:p>
     <w:p>
       <w:pPr>
-        <w:pStyle w:val="736"/>
-      </w:pPr>
-      <w:r>
-        <w:t>Un dialogo su un oggetto che non è un personaggio</w:t>
+        <w:pStyle w:val="724"/>
+      </w:pPr>
+      <w:r>
+        <w:t>Saluto, battute e stato di conversazione non richiedono che l'oggetto sia spuntato come «personaggio (png)»: qualunque oggetto può averli — un terminale, per esempio, che ha senso usare ma non ha senso salutare. Per aprirgli il dialogo senza passare da «parla» (bloccato sui non-personaggi, e comunque «parla con il terminale» suona male), aggiungete una regola che intercetta il verbo giusto — «usa terminale» — con l'effetto avvia dialogo (saluto + battute). E se il commiato di default, «Saluti «nome».», non calza, scrivete un congedo: comparirà al posto suo, sia quando il giocatore esce sia quando le battute finiscono da sole.</w:t>
+      </w:r>
+      <w:r>
+        <w:t xml:space="preserve"> In pratica, una regola come questa:</w:t>
+      </w:r>
+    </w:p>
+    <w:p>
+      <w:pPr>
+        <w:pStyle w:val="771"/>
+      </w:pPr>
+      <w:r>
+        <w:t>{ "id": "usa_terminale",</w:t>
+        <w:br/>
+      </w:r>
+      <w:r>
+        <w:t xml:space="preserve">  "quando": { "verbo": "usa", "oggetto": "terminale" },</w:t>
+        <w:br/>
+      </w:r>
+      <w:r>
+        <w:t xml:space="preserve">  "allora": [ { "avvia_dialogo": "terminale" } ] }</w:t>
       </w:r>
     </w:p>
     <w:p>

</xml_diff>

<commit_message>
advcore 1.18.1 / gui 2.3.1: voce "0." del menu dialogo personalizzabile
props["etichetta_uscita"] sostituisce il default "saluta e vai" nella
riga "0." del menu di dialogo (advcore/rules.py:menu_dialogo), stesso
meccanismo e stessa ragione del congedo (advcore 1.18.0): emerso
testando l'avventura con il terminale, per cui "saluta e vai" ha lo
stesso problema di "Saluti terminale.".

Nuovo campo nel form Oggetto dell'editor, accanto a "congedo".
Aggiornati VERSIONI.md, CLAUDE.md e il manuale d'uso.

Co-Authored-By: Claude Sonnet 5 <noreply@anthropic.com>
</commit_message>
<xml_diff>
--- a/Manuale di Pasifae.docx
+++ b/Manuale di Pasifae.docx
@@ -16330,6 +16330,20 @@
     <w:p>
       <w:pPr>
         <w:pStyle w:val="725"/>
+      </w:pPr>
+      <w:r>
+        <w:rPr>
+          <w:b/>
+        </w:rPr>
+        <w:t>voce «0.» del menu</w:t>
+      </w:r>
+      <w:r>
+        <w:t xml:space="preserve"> — l'etichetta della riga di uscita dal dialogo (default «saluta e vai»): stesso discorso del congedo, e stessa ragione (un terminale non lo si saluta);</w:t>
+      </w:r>
+    </w:p>
+    <w:p>
+      <w:pPr>
+        <w:pStyle w:val="725"/>
         <w:numPr>
           <w:ilvl w:val="0"/>
           <w:numId w:val="21"/>
@@ -17569,7 +17583,7 @@
         <w:pStyle w:val="724"/>
       </w:pPr>
       <w:r>
-        <w:t>Saluto, battute e stato di conversazione non richiedono che l'oggetto sia spuntato come «personaggio (png)»: qualunque oggetto può averli — un terminale, per esempio, che ha senso usare ma non ha senso salutare. Per aprirgli il dialogo senza passare da «parla» (bloccato sui non-personaggi, e comunque «parla con il terminale» suona male), aggiungete una regola che intercetta il verbo giusto — «usa terminale» — con l'effetto avvia dialogo (saluto + battute). E se il commiato di default, «Saluti «nome».», non calza, scrivete un congedo: comparirà al posto suo, sia quando il giocatore esce sia quando le battute finiscono da sole.</w:t>
+        <w:t>Saluto, battute e stato di conversazione non richiedono che l'oggetto sia spuntato come «personaggio (png)»: qualunque oggetto può averli — un terminale, per esempio, che ha senso usare ma non ha senso salutare. Per aprirgli il dialogo senza passare da «parla» (bloccato sui non-personaggi, e comunque «parla con il terminale» suona male), aggiungete una regola che intercetta il verbo giusto — «usa terminale» — con l'effetto avvia dialogo (saluto + battute). E se il commiato di default, «Saluti «nome».», non calza, scrivete un congedo: comparirà al posto suo, sia quando il giocatore esce sia quando le battute finiscono da sole. Lo stesso vale per la voce «0.» del menu («saluta e vai» di default): la sostituisce l'etichetta_uscita.</w:t>
       </w:r>
       <w:r>
         <w:t xml:space="preserve"> In pratica, una regola come questa:</w:t>

</xml_diff>

<commit_message>
advcore 1.19.0 / gui 2.4.0: oggetti nascosti, rivelabili da regola
Nuova props["nascosto"]: un oggetto nascosto è escluso da
Mondo.in_scope() (quindi dal parser, non solo dall'elenco della
stanza) finché una regola non lo rivela con l'effetto mostra_oggetto
(simmetrico: nascondi_oggetto). Diverso da "scenario", che resta
sempre esaminabile/nominabile: un oggetto nascosto risponde "Non vedo
nessun..." come se non esistesse. Ignorato anche da "prendi tutto" e
dal contenuto elencato di un contenitore aperto.

Editor: checkbox "nascosto" nel form Oggetto, nuove voci "mostra/
nascondi oggetto" nel catalogo effetti delle regole. Aggiornati
VERSIONI.md, CLAUDE.md e il manuale d'uso (cap. 5 e tabella effetti
del cap. 6).

Co-Authored-By: Claude Sonnet 5 <noreply@anthropic.com>
</commit_message>
<xml_diff>
--- a/Manuale di Pasifae.docx
+++ b/Manuale di Pasifae.docx
@@ -129,7 +129,7 @@
         <w:rPr/>
       </w:pPr>
       <w:r>
-        <w:t>Edizione 2026 · Pasifae Editor 2.3 · Pasifae Engine 1.18</w:t>
+        <w:t>Edizione 2026 · Pasifae Editor 2.4 · Pasifae Engine 1.19</w:t>
       </w:r>
       <w:r/>
     </w:p>
@@ -11754,6 +11754,14 @@
     </w:p>
     <w:p>
       <w:pPr>
+        <w:pStyle w:val="724"/>
+      </w:pPr>
+      <w:r>
+        <w:t>nascosto è un'altra cosa, non un sinonimo di scenario: uno scenario resta sempre lì, semplicemente non elencato; un oggetto nascosto il giocatore non sa nemmeno che c'è — esaminarlo o prenderlo per nome risponde «Non vedo nessun…» come se non esistesse, finché una regola non lo rivela con l'effetto mostra oggetto (tabella nel capitolo 6). Utile per ciò che si scopre aprendo un cassetto, spostando un quadro, frugando in un cumulo di paglia.</w:t>
+      </w:r>
+    </w:p>
+    <w:p>
+      <w:pPr>
         <w:pStyle w:val="736"/>
         <w:pBdr/>
         <w:spacing/>
@@ -14301,6 +14309,29 @@
               <w:t xml:space="preserve">come dice — per le aperture condizionate</w:t>
             </w:r>
             <w:r/>
+          </w:p>
+        </w:tc>
+      </w:tr>
+      <w:tr>
+        <w:trPr/>
+        <w:tc>
+          <w:tcPr>
+            <w:tcBorders/>
+          </w:tcPr>
+          <w:p>
+            <w:r>
+              <w:t>mostra/nascondi oggetto</w:t>
+            </w:r>
+          </w:p>
+        </w:tc>
+        <w:tc>
+          <w:tcPr>
+            <w:tcBorders/>
+          </w:tcPr>
+          <w:p>
+            <w:r>
+              <w:t>rivela o rinasconde un oggetto nascosto (capitolo 5)</w:t>
+            </w:r>
           </w:p>
         </w:tc>
       </w:tr>

</xml_diff>

<commit_message>
advcore 1.20.1 / gui 2.7.0: mappa coerente con le direzioni cardinali
- gui/mappa.py: la mappa dell'editor rispetta nord/sud/est/ovest sia in
  creazione (trascinamento destro con inferenza automatica della
  direzione, anche verso il vuoto: crea una stanza collegata) sia in
  trascinamento (vincolo morbido sull'asse pertinente per le stanze già
  collegate cardinalmente).
- advcore/mappa.py: corretto _layout, che appiattiva in un'unica riga
  "isolate" qualunque gruppo di stanze raggiungibile dal resto del mondo
  solo tramite un'uscita non cardinale (dentro/fuori/su/giu), perdendone
  la geometria interna — bug scoperto aprendo un'avventura reale
  (Hyperion) con più aree collegate da passaggi non cardinali.

Co-Authored-By: Claude Sonnet 5 <noreply@anthropic.com>
</commit_message>
<xml_diff>
--- a/Manuale di Pasifae.docx
+++ b/Manuale di Pasifae.docx
@@ -129,7 +129,7 @@
         <w:rPr/>
       </w:pPr>
       <w:r>
-        <w:t>Edizione 2026 · Pasifae Editor 2.6 · Pasifae Engine 1.20</w:t>
+        <w:t>Edizione 2026 · Pasifae Editor 2.7 · Pasifae Engine 1.20</w:t>
       </w:r>
       <w:r/>
     </w:p>
@@ -5425,7 +5425,7 @@
         <w:t xml:space="preserve">Trascinate i riquadri</w:t>
       </w:r>
       <w:r>
-        <w:t xml:space="preserve"> per disegnare la pianta come la vedete in testa: la disposizione si salva insieme all’avventura.</w:t>
+        <w:t xml:space="preserve"> per disegnare la pianta come la vedete in testa: la disposizione si salva insieme all’avventura — nord sopra, sud sotto, est a destra, ovest a sinistra; se una stanza è già collegata da un’uscita cardinale, trascinandola non può finire dalla parte sbagliata (resta libero il movimento sull’asse trasversale).</w:t>
       </w:r>
       <w:r/>
     </w:p>
@@ -5444,7 +5444,7 @@
         <w:t xml:space="preserve">Tasto destro e trascinate</w:t>
       </w:r>
       <w:r>
-        <w:t xml:space="preserve"> da una stanza a un’altra per creare un’uscita: l’editor chiede la direzione e, se volete, crea anche il ritorno.</w:t>
+        <w:t xml:space="preserve"> da una stanza a un’altra per creare un’uscita: se la posizione indica già una direzione libera e univoca, l’uscita — col ritorno — si crea subito, senza altro; l’editor chiede la direzione solo per sciogliere un’ambiguità o quando quella ovvia è già occupata. Trascinate invece verso il vuoto per creare una nuova stanza già collegata, nella direzione suggerita dal punto di rilascio.</w:t>
       </w:r>
       <w:r/>
     </w:p>

</xml_diff>